<commit_message>
fix(routing_algorithms): fix "divison" typo in barcelona_division.py
- rename barcelona_divison.py to barcelona_division.py and update every
  reference (heuristics/h_bcn.py, analysis/algorithms_comparison.py) and
  docstring/comment mentioning the old name
- optimum_weight_check.py: mention a_star_h_bcn_report.txt in its docstring
  (4 report files now, not 3) to match the h_bcn wiring
- update routing_algorithms/README.md accordingly
</commit_message>
<xml_diff>
--- a/.work/07.06.docx
+++ b/.work/07.06.docx
@@ -202,11 +202,13 @@
         </w:numPr>
         <w:rPr>
           <w:rFonts w:ascii="Arial" w:hAnsi="Arial" w:cs="Arial"/>
-        </w:rPr>
-      </w:pPr>
-      <w:r>
-        <w:rPr>
-          <w:rFonts w:ascii="Arial" w:hAnsi="Arial" w:cs="Arial"/>
+          <w:color w:val="8DD873" w:themeColor="accent6" w:themeTint="99"/>
+        </w:rPr>
+      </w:pPr>
+      <w:r>
+        <w:rPr>
+          <w:rFonts w:ascii="Arial" w:hAnsi="Arial" w:cs="Arial"/>
+          <w:color w:val="8DD873" w:themeColor="accent6" w:themeTint="99"/>
         </w:rPr>
         <w:t>Contestar missatge</w:t>
       </w:r>
@@ -235,6 +237,25 @@
       <w:pPr>
         <w:pStyle w:val="ListParagraph"/>
         <w:numPr>
+          <w:ilvl w:val="1"/>
+          <w:numId w:val="1"/>
+        </w:numPr>
+        <w:rPr>
+          <w:rFonts w:ascii="Arial" w:hAnsi="Arial" w:cs="Arial"/>
+          <w:color w:val="8DD873" w:themeColor="accent6" w:themeTint="99"/>
+        </w:rPr>
+      </w:pPr>
+      <w:r>
+        <w:rPr>
+          <w:rFonts w:ascii="Arial" w:hAnsi="Arial" w:cs="Arial"/>
+        </w:rPr>
+        <w:t>Apuntar dubtes que m’ha resolt</w:t>
+      </w:r>
+    </w:p>
+    <w:p>
+      <w:pPr>
+        <w:pStyle w:val="ListParagraph"/>
+        <w:numPr>
           <w:ilvl w:val="0"/>
           <w:numId w:val="1"/>
         </w:numPr>
@@ -409,6 +430,30 @@
           <w:color w:val="8DD873" w:themeColor="accent6" w:themeTint="99"/>
         </w:rPr>
         <w:t>Docu</w:t>
+      </w:r>
+    </w:p>
+    <w:p>
+      <w:pPr>
+        <w:pStyle w:val="ListParagraph"/>
+        <w:numPr>
+          <w:ilvl w:val="1"/>
+          <w:numId w:val="1"/>
+        </w:numPr>
+        <w:rPr>
+          <w:rFonts w:ascii="Arial" w:hAnsi="Arial" w:cs="Arial"/>
+        </w:rPr>
+      </w:pPr>
+      <w:r>
+        <w:rPr>
+          <w:rFonts w:ascii="Arial" w:hAnsi="Arial" w:cs="Arial"/>
+        </w:rPr>
+        <w:t>Gràfic</w:t>
+      </w:r>
+      <w:r>
+        <w:rPr>
+          <w:rFonts w:ascii="Arial" w:hAnsi="Arial" w:cs="Arial"/>
+        </w:rPr>
+        <w:t xml:space="preserve"> en el que es vegin les diferents regions i els ponts partint del graf que ja tenim</w:t>
       </w:r>
     </w:p>
     <w:p>

</xml_diff>